<commit_message>
SOICT 2026 #5590: camera-ready đã nộp EasyChair 30/10 22:08
Phụ lục A in prompt bằng tiếng Anh, thêm mốc Qwen2.5-VL-7B và hạt S/202,
soát câu toàn bài (15 trang). Thêm nguồn camera_ready_5590/ (main.tex,
llncs.cls, hình, thông tin tác giả liên hệ). Ghi tiến độ nộp bài và đăng
ký hội nghị vào CAMERA_READY_ACTION_22_10.md. ZIP và bản quét form ký
tay không đưa vào git.

Co-Authored-By: Claude Opus 5.5 <noreply@anthropic.com>
</commit_message>
<xml_diff>
--- a/paper/soict2026/guistep/License_to_Publish_5590_dien_san.docx
+++ b/paper/soict2026/guistep/License_to_Publish_5590_dien_san.docx
@@ -686,7 +686,6 @@
             <w:placeholder>
               <w:docPart w:val="76DA22AC063543CBB037BC108227BDBA"/>
             </w:placeholder>
-            <w:showingPlcHdr/>
           </w:sdtPr>
           <w:sdtContent>
             <w:tc>
@@ -972,7 +971,6 @@
             <w:placeholder>
               <w:docPart w:val="75F61420D7214EC6A79537ACAAEFFE02"/>
             </w:placeholder>
-            <w:showingPlcHdr/>
           </w:sdtPr>
           <w:sdtContent>
             <w:tc>
@@ -1185,7 +1183,6 @@
             <w:placeholder>
               <w:docPart w:val="C3586137BDCA4C559954704D6C1621B6"/>
             </w:placeholder>
-            <w:showingPlcHdr/>
           </w:sdtPr>
           <w:sdtContent>
             <w:tc>
@@ -4760,43 +4757,7 @@
                 <w:sz w:val="14"/>
                 <w:szCs w:val="18"/>
               </w:rPr>
-              <w:t> </w:t>
-            </w:r>
-            <w:r>
-              <w:rPr>
-                <w:rFonts w:asciiTheme="minorHAnsi" w:hAnsiTheme="minorHAnsi" w:cstheme="minorHAnsi"/>
-                <w:noProof/>
-                <w:sz w:val="14"/>
-                <w:szCs w:val="18"/>
-              </w:rPr>
-              <w:t> </w:t>
-            </w:r>
-            <w:r>
-              <w:rPr>
-                <w:rFonts w:asciiTheme="minorHAnsi" w:hAnsiTheme="minorHAnsi" w:cstheme="minorHAnsi"/>
-                <w:noProof/>
-                <w:sz w:val="14"/>
-                <w:szCs w:val="18"/>
-              </w:rPr>
-              <w:t> </w:t>
-            </w:r>
-            <w:r>
-              <w:rPr>
-                <w:rFonts w:asciiTheme="minorHAnsi" w:hAnsiTheme="minorHAnsi" w:cstheme="minorHAnsi"/>
-                <w:noProof/>
-                <w:sz w:val="14"/>
-                <w:szCs w:val="18"/>
-              </w:rPr>
-              <w:t> </w:t>
-            </w:r>
-            <w:r>
-              <w:rPr>
-                <w:rFonts w:asciiTheme="minorHAnsi" w:hAnsiTheme="minorHAnsi" w:cstheme="minorHAnsi"/>
-                <w:noProof/>
-                <w:sz w:val="14"/>
-                <w:szCs w:val="18"/>
-              </w:rPr>
-              <w:t> </w:t>
+              <w:t xml:space="preserve">30/10/2026</w:t>
             </w:r>
             <w:r>
               <w:rPr>
@@ -4972,43 +4933,7 @@
                 <w:sz w:val="14"/>
                 <w:szCs w:val="18"/>
               </w:rPr>
-              <w:t> </w:t>
-            </w:r>
-            <w:r>
-              <w:rPr>
-                <w:rFonts w:asciiTheme="minorHAnsi" w:hAnsiTheme="minorHAnsi" w:cstheme="minorHAnsi"/>
-                <w:noProof/>
-                <w:sz w:val="14"/>
-                <w:szCs w:val="18"/>
-              </w:rPr>
-              <w:t> </w:t>
-            </w:r>
-            <w:r>
-              <w:rPr>
-                <w:rFonts w:asciiTheme="minorHAnsi" w:hAnsiTheme="minorHAnsi" w:cstheme="minorHAnsi"/>
-                <w:noProof/>
-                <w:sz w:val="14"/>
-                <w:szCs w:val="18"/>
-              </w:rPr>
-              <w:t> </w:t>
-            </w:r>
-            <w:r>
-              <w:rPr>
-                <w:rFonts w:asciiTheme="minorHAnsi" w:hAnsiTheme="minorHAnsi" w:cstheme="minorHAnsi"/>
-                <w:noProof/>
-                <w:sz w:val="14"/>
-                <w:szCs w:val="18"/>
-              </w:rPr>
-              <w:t> </w:t>
-            </w:r>
-            <w:r>
-              <w:rPr>
-                <w:rFonts w:asciiTheme="minorHAnsi" w:hAnsiTheme="minorHAnsi" w:cstheme="minorHAnsi"/>
-                <w:noProof/>
-                <w:sz w:val="14"/>
-                <w:szCs w:val="18"/>
-              </w:rPr>
-              <w:t> </w:t>
+              <w:t xml:space="preserve">5F Lac Long Quan, Hoa Binh Ward, Ho Chi Minh City, Vietnam</w:t>
             </w:r>
             <w:r>
               <w:rPr>

</xml_diff>